<commit_message>
Sales funnel report v2: add Stripe self-serve dollars + customer value
The Stripe->Mixpanel integration (Amount Charged, whole USD, validated
against plan-price value distribution) enables partial dollar analysis
the webhook events cannot (Q27, 36% coverage):
- Monthly gross revenue/payers/ARPU/refunds Nov 2025 - Jul 2026:
  gross fell ~55% ($150.8k -> $67.3k/mo) while payers recovered
  (86 -> 119) - revenue/payer down $874 -> $565 (plan-mix shift)
- Customer value, trailing 12mo Stripe payers: avg $2,549 total,
  median $959, p90 $5,489, 3.35 charges/payer
- Undocumented price points observed ($599/$959/$175)
- New Q28: verify integration completeness vs Stripe dashboard
Scope caveat throughout: Stripe self-serve only; excludes Cardcom and
manual/Close deals.

Co-Authored-By: Claude Fable 5 <noreply@anthropic.com>
Claude-Session: https://claude.ai/code/session_01RbYetk3cS2huA4dPo47jtj
</commit_message>
<xml_diff>
--- a/deliverables/Sales-Funnel-Report-2026-07.docx
+++ b/deliverables/Sales-Funnel-Report-2026-07.docx
@@ -31,7 +31,7 @@
           <w:sz w:val="22"/>
           <w:szCs w:val="22"/>
         </w:rPr>
-        <w:t xml:space="preserve">IMAI platform · self-serve + sales-led funnels · measured 2026-07-21 via Mixpanel (project 3432835) · dollar analysis intentionally excluded (blocked on prod DB + Close access)</w:t>
+        <w:t xml:space="preserve">IMAI platform · self-serve + sales-led funnels · measured 2026-07-21 via Mixpanel (project 3432835) · dollar figures: Stripe self-serve engine only (excludes Cardcom + manual/Close deals; unverified vs Stripe dashboard, Q28)</w:t>
       </w:r>
     </w:p>
     <w:p>
@@ -141,6 +141,42 @@
           <w:sz w:val="22"/>
           <w:szCs w:val="22"/>
         </w:rPr>
+        <w:t xml:space="preserve">Stripe self-serve revenue is in decline despite the funnel wins: gross succeeded charges fell from ~$150.8k/mo (Nov 2025) to ~$67.3k/mo (Jun 2026). Payers recovered off the February trough (86 → 119 by June) but revenue-per-payer fell ~$874 → ~$565 — new self-serve cohorts buy smaller plans than the legacy base churning out.</w:t>
+      </w:r>
+    </w:p>
+    <w:p>
+      <w:pPr>
+        <w:pStyle w:val="ListParagraph"/>
+        <w:numPr>
+          <w:ilvl w:val="0"/>
+          <w:numId w:val="2"/>
+        </w:numPr>
+        <w:spacing w:after="80"/>
+      </w:pPr>
+      <w:r>
+        <w:rPr>
+          <w:rFonts w:ascii="Calibri" w:cs="Calibri" w:eastAsia="Calibri" w:hAnsi="Calibri"/>
+          <w:sz w:val="22"/>
+          <w:szCs w:val="22"/>
+        </w:rPr>
+        <w:t xml:space="preserve">Customer $ value (Stripe, trailing 12 months): the average payer is worth $2,549 in total charges; median $959; p90 $5,489; 3.35 successful charges per payer.</w:t>
+      </w:r>
+    </w:p>
+    <w:p>
+      <w:pPr>
+        <w:pStyle w:val="ListParagraph"/>
+        <w:numPr>
+          <w:ilvl w:val="0"/>
+          <w:numId w:val="2"/>
+        </w:numPr>
+        <w:spacing w:after="80"/>
+      </w:pPr>
+      <w:r>
+        <w:rPr>
+          <w:rFonts w:ascii="Calibri" w:cs="Calibri" w:eastAsia="Calibri" w:hAnsi="Calibri"/>
+          <w:sz w:val="22"/>
+          <w:szCs w:val="22"/>
+        </w:rPr>
         <w:t xml:space="preserve">Expansion remains a vacuum (2–5 upgrades/month); active trial cancels improved from 60% of trials (May) to 41% (June).</w:t>
       </w:r>
     </w:p>
@@ -2530,7 +2566,1340 @@
         <w:rPr>
           <w:rFonts w:ascii="Calibri" w:cs="Calibri" w:eastAsia="Calibri" w:hAnsi="Calibri"/>
         </w:rPr>
-        <w:t xml:space="preserve">3. Funnel B — sales-led (Close CRM mirrors — approximate)</w:t>
+        <w:t xml:space="preserve">3. Self-serve dollars — Stripe engine only</w:t>
+      </w:r>
+    </w:p>
+    <w:p>
+      <w:pPr>
+        <w:spacing w:after="120"/>
+      </w:pPr>
+      <w:r>
+        <w:rPr>
+          <w:rFonts w:ascii="Calibri" w:cs="Calibri" w:eastAsia="Calibri" w:hAnsi="Calibri"/>
+          <w:sz w:val="22"/>
+          <w:szCs w:val="22"/>
+        </w:rPr>
+        <w:t xml:space="preserve">Source: the Stripe→Mixpanel integration — Payment Attempt with Status='succeeded', Amount Charged in whole USD (unit validated against the value distribution: plan-price shapes 99/499/599/1199/1200 plus custom amounts; failed charges log $0 and are excluded). NOT covered: Cardcom (IL) self-serve and all manual/invoiced Close deals — the majority of paying accounts. Completeness vs the Stripe dashboard is unverified (Q28) — treat as directional until cross-checked.</w:t>
+      </w:r>
+    </w:p>
+    <w:tbl>
+      <w:tblPr>
+        <w:tblW w:type="dxa" w:w="10400"/>
+        <w:tblBorders>
+          <w:top w:val="single" w:color="auto" w:sz="4"/>
+          <w:left w:val="single" w:color="auto" w:sz="4"/>
+          <w:bottom w:val="single" w:color="auto" w:sz="4"/>
+          <w:right w:val="single" w:color="auto" w:sz="4"/>
+          <w:insideH w:val="single" w:color="auto" w:sz="4"/>
+          <w:insideV w:val="single" w:color="auto" w:sz="4"/>
+        </w:tblBorders>
+      </w:tblPr>
+      <w:tblGrid>
+        <w:gridCol w:w="1700"/>
+        <w:gridCol w:w="2600"/>
+        <w:gridCol w:w="2100"/>
+        <w:gridCol w:w="2100"/>
+        <w:gridCol w:w="1900"/>
+      </w:tblGrid>
+      <w:tr>
+        <w:trPr>
+          <w:tblHeader/>
+        </w:trPr>
+        <w:tc>
+          <w:tcPr>
+            <w:tcW w:type="dxa" w:w="1700"/>
+            <w:shd w:fill="1F4E79" w:val="clear"/>
+            <w:tcMar>
+              <w:top w:type="dxa" w:w="60"/>
+              <w:left w:type="dxa" w:w="100"/>
+              <w:bottom w:type="dxa" w:w="60"/>
+              <w:right w:type="dxa" w:w="100"/>
+            </w:tcMar>
+          </w:tcPr>
+          <w:p>
+            <w:r>
+              <w:rPr>
+                <w:rFonts w:ascii="Calibri" w:cs="Calibri" w:eastAsia="Calibri" w:hAnsi="Calibri"/>
+                <w:b/>
+                <w:bCs/>
+                <w:color w:val="FFFFFF"/>
+                <w:sz w:val="18"/>
+                <w:szCs w:val="18"/>
+              </w:rPr>
+              <w:t xml:space="preserve">Month</w:t>
+            </w:r>
+          </w:p>
+        </w:tc>
+        <w:tc>
+          <w:tcPr>
+            <w:tcW w:type="dxa" w:w="2600"/>
+            <w:shd w:fill="1F4E79" w:val="clear"/>
+            <w:tcMar>
+              <w:top w:type="dxa" w:w="60"/>
+              <w:left w:type="dxa" w:w="100"/>
+              <w:bottom w:type="dxa" w:w="60"/>
+              <w:right w:type="dxa" w:w="100"/>
+            </w:tcMar>
+          </w:tcPr>
+          <w:p>
+            <w:r>
+              <w:rPr>
+                <w:rFonts w:ascii="Calibri" w:cs="Calibri" w:eastAsia="Calibri" w:hAnsi="Calibri"/>
+                <w:b/>
+                <w:bCs/>
+                <w:color w:val="FFFFFF"/>
+                <w:sz w:val="18"/>
+                <w:szCs w:val="18"/>
+              </w:rPr>
+              <w:t xml:space="preserve">Gross revenue (succeeded)</w:t>
+            </w:r>
+          </w:p>
+        </w:tc>
+        <w:tc>
+          <w:tcPr>
+            <w:tcW w:type="dxa" w:w="2100"/>
+            <w:shd w:fill="1F4E79" w:val="clear"/>
+            <w:tcMar>
+              <w:top w:type="dxa" w:w="60"/>
+              <w:left w:type="dxa" w:w="100"/>
+              <w:bottom w:type="dxa" w:w="60"/>
+              <w:right w:type="dxa" w:w="100"/>
+            </w:tcMar>
+          </w:tcPr>
+          <w:p>
+            <w:r>
+              <w:rPr>
+                <w:rFonts w:ascii="Calibri" w:cs="Calibri" w:eastAsia="Calibri" w:hAnsi="Calibri"/>
+                <w:b/>
+                <w:bCs/>
+                <w:color w:val="FFFFFF"/>
+                <w:sz w:val="18"/>
+                <w:szCs w:val="18"/>
+              </w:rPr>
+              <w:t xml:space="preserve">Unique payers</w:t>
+            </w:r>
+          </w:p>
+        </w:tc>
+        <w:tc>
+          <w:tcPr>
+            <w:tcW w:type="dxa" w:w="2100"/>
+            <w:shd w:fill="1F4E79" w:val="clear"/>
+            <w:tcMar>
+              <w:top w:type="dxa" w:w="60"/>
+              <w:left w:type="dxa" w:w="100"/>
+              <w:bottom w:type="dxa" w:w="60"/>
+              <w:right w:type="dxa" w:w="100"/>
+            </w:tcMar>
+          </w:tcPr>
+          <w:p>
+            <w:r>
+              <w:rPr>
+                <w:rFonts w:ascii="Calibri" w:cs="Calibri" w:eastAsia="Calibri" w:hAnsi="Calibri"/>
+                <w:b/>
+                <w:bCs/>
+                <w:color w:val="FFFFFF"/>
+                <w:sz w:val="18"/>
+                <w:szCs w:val="18"/>
+              </w:rPr>
+              <w:t xml:space="preserve">Revenue / payer</w:t>
+            </w:r>
+          </w:p>
+        </w:tc>
+        <w:tc>
+          <w:tcPr>
+            <w:tcW w:type="dxa" w:w="1900"/>
+            <w:shd w:fill="1F4E79" w:val="clear"/>
+            <w:tcMar>
+              <w:top w:type="dxa" w:w="60"/>
+              <w:left w:type="dxa" w:w="100"/>
+              <w:bottom w:type="dxa" w:w="60"/>
+              <w:right w:type="dxa" w:w="100"/>
+            </w:tcMar>
+          </w:tcPr>
+          <w:p>
+            <w:r>
+              <w:rPr>
+                <w:rFonts w:ascii="Calibri" w:cs="Calibri" w:eastAsia="Calibri" w:hAnsi="Calibri"/>
+                <w:b/>
+                <w:bCs/>
+                <w:color w:val="FFFFFF"/>
+                <w:sz w:val="18"/>
+                <w:szCs w:val="18"/>
+              </w:rPr>
+              <w:t xml:space="preserve">Refunds</w:t>
+            </w:r>
+          </w:p>
+        </w:tc>
+      </w:tr>
+      <w:tr>
+        <w:tc>
+          <w:tcPr>
+            <w:tcW w:type="dxa" w:w="1700"/>
+            <w:tcMar>
+              <w:top w:type="dxa" w:w="60"/>
+              <w:left w:type="dxa" w:w="100"/>
+              <w:bottom w:type="dxa" w:w="60"/>
+              <w:right w:type="dxa" w:w="100"/>
+            </w:tcMar>
+          </w:tcPr>
+          <w:p>
+            <w:r>
+              <w:rPr>
+                <w:rFonts w:ascii="Calibri" w:cs="Calibri" w:eastAsia="Calibri" w:hAnsi="Calibri"/>
+                <w:b w:val="false"/>
+                <w:bCs w:val="false"/>
+                <w:sz w:val="18"/>
+                <w:szCs w:val="18"/>
+              </w:rPr>
+              <w:t xml:space="preserve">Nov 2025</w:t>
+            </w:r>
+          </w:p>
+        </w:tc>
+        <w:tc>
+          <w:tcPr>
+            <w:tcW w:type="dxa" w:w="2600"/>
+            <w:tcMar>
+              <w:top w:type="dxa" w:w="60"/>
+              <w:left w:type="dxa" w:w="100"/>
+              <w:bottom w:type="dxa" w:w="60"/>
+              <w:right w:type="dxa" w:w="100"/>
+            </w:tcMar>
+          </w:tcPr>
+          <w:p>
+            <w:r>
+              <w:rPr>
+                <w:rFonts w:ascii="Calibri" w:cs="Calibri" w:eastAsia="Calibri" w:hAnsi="Calibri"/>
+                <w:b w:val="false"/>
+                <w:bCs w:val="false"/>
+                <w:sz w:val="18"/>
+                <w:szCs w:val="18"/>
+              </w:rPr>
+              <w:t xml:space="preserve">$150,836</w:t>
+            </w:r>
+          </w:p>
+        </w:tc>
+        <w:tc>
+          <w:tcPr>
+            <w:tcW w:type="dxa" w:w="2100"/>
+            <w:tcMar>
+              <w:top w:type="dxa" w:w="60"/>
+              <w:left w:type="dxa" w:w="100"/>
+              <w:bottom w:type="dxa" w:w="60"/>
+              <w:right w:type="dxa" w:w="100"/>
+            </w:tcMar>
+          </w:tcPr>
+          <w:p>
+            <w:r>
+              <w:rPr>
+                <w:rFonts w:ascii="Calibri" w:cs="Calibri" w:eastAsia="Calibri" w:hAnsi="Calibri"/>
+                <w:b w:val="false"/>
+                <w:bCs w:val="false"/>
+                <w:sz w:val="18"/>
+                <w:szCs w:val="18"/>
+              </w:rPr>
+              <w:t xml:space="preserve">171</w:t>
+            </w:r>
+          </w:p>
+        </w:tc>
+        <w:tc>
+          <w:tcPr>
+            <w:tcW w:type="dxa" w:w="2100"/>
+            <w:tcMar>
+              <w:top w:type="dxa" w:w="60"/>
+              <w:left w:type="dxa" w:w="100"/>
+              <w:bottom w:type="dxa" w:w="60"/>
+              <w:right w:type="dxa" w:w="100"/>
+            </w:tcMar>
+          </w:tcPr>
+          <w:p>
+            <w:r>
+              <w:rPr>
+                <w:rFonts w:ascii="Calibri" w:cs="Calibri" w:eastAsia="Calibri" w:hAnsi="Calibri"/>
+                <w:b w:val="false"/>
+                <w:bCs w:val="false"/>
+                <w:sz w:val="18"/>
+                <w:szCs w:val="18"/>
+              </w:rPr>
+              <w:t xml:space="preserve">$882</w:t>
+            </w:r>
+          </w:p>
+        </w:tc>
+        <w:tc>
+          <w:tcPr>
+            <w:tcW w:type="dxa" w:w="1900"/>
+            <w:tcMar>
+              <w:top w:type="dxa" w:w="60"/>
+              <w:left w:type="dxa" w:w="100"/>
+              <w:bottom w:type="dxa" w:w="60"/>
+              <w:right w:type="dxa" w:w="100"/>
+            </w:tcMar>
+          </w:tcPr>
+          <w:p>
+            <w:r>
+              <w:rPr>
+                <w:rFonts w:ascii="Calibri" w:cs="Calibri" w:eastAsia="Calibri" w:hAnsi="Calibri"/>
+                <w:b w:val="false"/>
+                <w:bCs w:val="false"/>
+                <w:sz w:val="18"/>
+                <w:szCs w:val="18"/>
+              </w:rPr>
+              <w:t xml:space="preserve">$12,267</w:t>
+            </w:r>
+          </w:p>
+        </w:tc>
+      </w:tr>
+      <w:tr>
+        <w:tc>
+          <w:tcPr>
+            <w:tcW w:type="dxa" w:w="1700"/>
+            <w:shd w:fill="F2F2F2" w:val="clear"/>
+            <w:tcMar>
+              <w:top w:type="dxa" w:w="60"/>
+              <w:left w:type="dxa" w:w="100"/>
+              <w:bottom w:type="dxa" w:w="60"/>
+              <w:right w:type="dxa" w:w="100"/>
+            </w:tcMar>
+          </w:tcPr>
+          <w:p>
+            <w:r>
+              <w:rPr>
+                <w:rFonts w:ascii="Calibri" w:cs="Calibri" w:eastAsia="Calibri" w:hAnsi="Calibri"/>
+                <w:b w:val="false"/>
+                <w:bCs w:val="false"/>
+                <w:sz w:val="18"/>
+                <w:szCs w:val="18"/>
+              </w:rPr>
+              <w:t xml:space="preserve">Dec 2025</w:t>
+            </w:r>
+          </w:p>
+        </w:tc>
+        <w:tc>
+          <w:tcPr>
+            <w:tcW w:type="dxa" w:w="2600"/>
+            <w:shd w:fill="F2F2F2" w:val="clear"/>
+            <w:tcMar>
+              <w:top w:type="dxa" w:w="60"/>
+              <w:left w:type="dxa" w:w="100"/>
+              <w:bottom w:type="dxa" w:w="60"/>
+              <w:right w:type="dxa" w:w="100"/>
+            </w:tcMar>
+          </w:tcPr>
+          <w:p>
+            <w:r>
+              <w:rPr>
+                <w:rFonts w:ascii="Calibri" w:cs="Calibri" w:eastAsia="Calibri" w:hAnsi="Calibri"/>
+                <w:b w:val="false"/>
+                <w:bCs w:val="false"/>
+                <w:sz w:val="18"/>
+                <w:szCs w:val="18"/>
+              </w:rPr>
+              <w:t xml:space="preserve">$139,038</w:t>
+            </w:r>
+          </w:p>
+        </w:tc>
+        <w:tc>
+          <w:tcPr>
+            <w:tcW w:type="dxa" w:w="2100"/>
+            <w:shd w:fill="F2F2F2" w:val="clear"/>
+            <w:tcMar>
+              <w:top w:type="dxa" w:w="60"/>
+              <w:left w:type="dxa" w:w="100"/>
+              <w:bottom w:type="dxa" w:w="60"/>
+              <w:right w:type="dxa" w:w="100"/>
+            </w:tcMar>
+          </w:tcPr>
+          <w:p>
+            <w:r>
+              <w:rPr>
+                <w:rFonts w:ascii="Calibri" w:cs="Calibri" w:eastAsia="Calibri" w:hAnsi="Calibri"/>
+                <w:b w:val="false"/>
+                <w:bCs w:val="false"/>
+                <w:sz w:val="18"/>
+                <w:szCs w:val="18"/>
+              </w:rPr>
+              <w:t xml:space="preserve">159</w:t>
+            </w:r>
+          </w:p>
+        </w:tc>
+        <w:tc>
+          <w:tcPr>
+            <w:tcW w:type="dxa" w:w="2100"/>
+            <w:shd w:fill="F2F2F2" w:val="clear"/>
+            <w:tcMar>
+              <w:top w:type="dxa" w:w="60"/>
+              <w:left w:type="dxa" w:w="100"/>
+              <w:bottom w:type="dxa" w:w="60"/>
+              <w:right w:type="dxa" w:w="100"/>
+            </w:tcMar>
+          </w:tcPr>
+          <w:p>
+            <w:r>
+              <w:rPr>
+                <w:rFonts w:ascii="Calibri" w:cs="Calibri" w:eastAsia="Calibri" w:hAnsi="Calibri"/>
+                <w:b w:val="false"/>
+                <w:bCs w:val="false"/>
+                <w:sz w:val="18"/>
+                <w:szCs w:val="18"/>
+              </w:rPr>
+              <w:t xml:space="preserve">$874</w:t>
+            </w:r>
+          </w:p>
+        </w:tc>
+        <w:tc>
+          <w:tcPr>
+            <w:tcW w:type="dxa" w:w="1900"/>
+            <w:shd w:fill="F2F2F2" w:val="clear"/>
+            <w:tcMar>
+              <w:top w:type="dxa" w:w="60"/>
+              <w:left w:type="dxa" w:w="100"/>
+              <w:bottom w:type="dxa" w:w="60"/>
+              <w:right w:type="dxa" w:w="100"/>
+            </w:tcMar>
+          </w:tcPr>
+          <w:p>
+            <w:r>
+              <w:rPr>
+                <w:rFonts w:ascii="Calibri" w:cs="Calibri" w:eastAsia="Calibri" w:hAnsi="Calibri"/>
+                <w:b w:val="false"/>
+                <w:bCs w:val="false"/>
+                <w:sz w:val="18"/>
+                <w:szCs w:val="18"/>
+              </w:rPr>
+              <w:t xml:space="preserve">$7,240</w:t>
+            </w:r>
+          </w:p>
+        </w:tc>
+      </w:tr>
+      <w:tr>
+        <w:tc>
+          <w:tcPr>
+            <w:tcW w:type="dxa" w:w="1700"/>
+            <w:tcMar>
+              <w:top w:type="dxa" w:w="60"/>
+              <w:left w:type="dxa" w:w="100"/>
+              <w:bottom w:type="dxa" w:w="60"/>
+              <w:right w:type="dxa" w:w="100"/>
+            </w:tcMar>
+          </w:tcPr>
+          <w:p>
+            <w:r>
+              <w:rPr>
+                <w:rFonts w:ascii="Calibri" w:cs="Calibri" w:eastAsia="Calibri" w:hAnsi="Calibri"/>
+                <w:b w:val="false"/>
+                <w:bCs w:val="false"/>
+                <w:sz w:val="18"/>
+                <w:szCs w:val="18"/>
+              </w:rPr>
+              <w:t xml:space="preserve">Jan 2026</w:t>
+            </w:r>
+          </w:p>
+        </w:tc>
+        <w:tc>
+          <w:tcPr>
+            <w:tcW w:type="dxa" w:w="2600"/>
+            <w:tcMar>
+              <w:top w:type="dxa" w:w="60"/>
+              <w:left w:type="dxa" w:w="100"/>
+              <w:bottom w:type="dxa" w:w="60"/>
+              <w:right w:type="dxa" w:w="100"/>
+            </w:tcMar>
+          </w:tcPr>
+          <w:p>
+            <w:r>
+              <w:rPr>
+                <w:rFonts w:ascii="Calibri" w:cs="Calibri" w:eastAsia="Calibri" w:hAnsi="Calibri"/>
+                <w:b w:val="false"/>
+                <w:bCs w:val="false"/>
+                <w:sz w:val="18"/>
+                <w:szCs w:val="18"/>
+              </w:rPr>
+              <w:t xml:space="preserve">$100,438</w:t>
+            </w:r>
+          </w:p>
+        </w:tc>
+        <w:tc>
+          <w:tcPr>
+            <w:tcW w:type="dxa" w:w="2100"/>
+            <w:tcMar>
+              <w:top w:type="dxa" w:w="60"/>
+              <w:left w:type="dxa" w:w="100"/>
+              <w:bottom w:type="dxa" w:w="60"/>
+              <w:right w:type="dxa" w:w="100"/>
+            </w:tcMar>
+          </w:tcPr>
+          <w:p>
+            <w:r>
+              <w:rPr>
+                <w:rFonts w:ascii="Calibri" w:cs="Calibri" w:eastAsia="Calibri" w:hAnsi="Calibri"/>
+                <w:b w:val="false"/>
+                <w:bCs w:val="false"/>
+                <w:sz w:val="18"/>
+                <w:szCs w:val="18"/>
+              </w:rPr>
+              <w:t xml:space="preserve">127</w:t>
+            </w:r>
+          </w:p>
+        </w:tc>
+        <w:tc>
+          <w:tcPr>
+            <w:tcW w:type="dxa" w:w="2100"/>
+            <w:tcMar>
+              <w:top w:type="dxa" w:w="60"/>
+              <w:left w:type="dxa" w:w="100"/>
+              <w:bottom w:type="dxa" w:w="60"/>
+              <w:right w:type="dxa" w:w="100"/>
+            </w:tcMar>
+          </w:tcPr>
+          <w:p>
+            <w:r>
+              <w:rPr>
+                <w:rFonts w:ascii="Calibri" w:cs="Calibri" w:eastAsia="Calibri" w:hAnsi="Calibri"/>
+                <w:b w:val="false"/>
+                <w:bCs w:val="false"/>
+                <w:sz w:val="18"/>
+                <w:szCs w:val="18"/>
+              </w:rPr>
+              <w:t xml:space="preserve">$791</w:t>
+            </w:r>
+          </w:p>
+        </w:tc>
+        <w:tc>
+          <w:tcPr>
+            <w:tcW w:type="dxa" w:w="1900"/>
+            <w:tcMar>
+              <w:top w:type="dxa" w:w="60"/>
+              <w:left w:type="dxa" w:w="100"/>
+              <w:bottom w:type="dxa" w:w="60"/>
+              <w:right w:type="dxa" w:w="100"/>
+            </w:tcMar>
+          </w:tcPr>
+          <w:p>
+            <w:r>
+              <w:rPr>
+                <w:rFonts w:ascii="Calibri" w:cs="Calibri" w:eastAsia="Calibri" w:hAnsi="Calibri"/>
+                <w:b w:val="false"/>
+                <w:bCs w:val="false"/>
+                <w:sz w:val="18"/>
+                <w:szCs w:val="18"/>
+              </w:rPr>
+              <w:t xml:space="preserve">$6,209</w:t>
+            </w:r>
+          </w:p>
+        </w:tc>
+      </w:tr>
+      <w:tr>
+        <w:tc>
+          <w:tcPr>
+            <w:tcW w:type="dxa" w:w="1700"/>
+            <w:shd w:fill="F2F2F2" w:val="clear"/>
+            <w:tcMar>
+              <w:top w:type="dxa" w:w="60"/>
+              <w:left w:type="dxa" w:w="100"/>
+              <w:bottom w:type="dxa" w:w="60"/>
+              <w:right w:type="dxa" w:w="100"/>
+            </w:tcMar>
+          </w:tcPr>
+          <w:p>
+            <w:r>
+              <w:rPr>
+                <w:rFonts w:ascii="Calibri" w:cs="Calibri" w:eastAsia="Calibri" w:hAnsi="Calibri"/>
+                <w:b w:val="false"/>
+                <w:bCs w:val="false"/>
+                <w:sz w:val="18"/>
+                <w:szCs w:val="18"/>
+              </w:rPr>
+              <w:t xml:space="preserve">Feb 2026</w:t>
+            </w:r>
+          </w:p>
+        </w:tc>
+        <w:tc>
+          <w:tcPr>
+            <w:tcW w:type="dxa" w:w="2600"/>
+            <w:shd w:fill="F2F2F2" w:val="clear"/>
+            <w:tcMar>
+              <w:top w:type="dxa" w:w="60"/>
+              <w:left w:type="dxa" w:w="100"/>
+              <w:bottom w:type="dxa" w:w="60"/>
+              <w:right w:type="dxa" w:w="100"/>
+            </w:tcMar>
+          </w:tcPr>
+          <w:p>
+            <w:r>
+              <w:rPr>
+                <w:rFonts w:ascii="Calibri" w:cs="Calibri" w:eastAsia="Calibri" w:hAnsi="Calibri"/>
+                <w:b w:val="false"/>
+                <w:bCs w:val="false"/>
+                <w:sz w:val="18"/>
+                <w:szCs w:val="18"/>
+              </w:rPr>
+              <w:t xml:space="preserve">$78,271</w:t>
+            </w:r>
+          </w:p>
+        </w:tc>
+        <w:tc>
+          <w:tcPr>
+            <w:tcW w:type="dxa" w:w="2100"/>
+            <w:shd w:fill="F2F2F2" w:val="clear"/>
+            <w:tcMar>
+              <w:top w:type="dxa" w:w="60"/>
+              <w:left w:type="dxa" w:w="100"/>
+              <w:bottom w:type="dxa" w:w="60"/>
+              <w:right w:type="dxa" w:w="100"/>
+            </w:tcMar>
+          </w:tcPr>
+          <w:p>
+            <w:r>
+              <w:rPr>
+                <w:rFonts w:ascii="Calibri" w:cs="Calibri" w:eastAsia="Calibri" w:hAnsi="Calibri"/>
+                <w:b w:val="false"/>
+                <w:bCs w:val="false"/>
+                <w:sz w:val="18"/>
+                <w:szCs w:val="18"/>
+              </w:rPr>
+              <w:t xml:space="preserve">86</w:t>
+            </w:r>
+          </w:p>
+        </w:tc>
+        <w:tc>
+          <w:tcPr>
+            <w:tcW w:type="dxa" w:w="2100"/>
+            <w:shd w:fill="F2F2F2" w:val="clear"/>
+            <w:tcMar>
+              <w:top w:type="dxa" w:w="60"/>
+              <w:left w:type="dxa" w:w="100"/>
+              <w:bottom w:type="dxa" w:w="60"/>
+              <w:right w:type="dxa" w:w="100"/>
+            </w:tcMar>
+          </w:tcPr>
+          <w:p>
+            <w:r>
+              <w:rPr>
+                <w:rFonts w:ascii="Calibri" w:cs="Calibri" w:eastAsia="Calibri" w:hAnsi="Calibri"/>
+                <w:b w:val="false"/>
+                <w:bCs w:val="false"/>
+                <w:sz w:val="18"/>
+                <w:szCs w:val="18"/>
+              </w:rPr>
+              <w:t xml:space="preserve">$910</w:t>
+            </w:r>
+          </w:p>
+        </w:tc>
+        <w:tc>
+          <w:tcPr>
+            <w:tcW w:type="dxa" w:w="1900"/>
+            <w:shd w:fill="F2F2F2" w:val="clear"/>
+            <w:tcMar>
+              <w:top w:type="dxa" w:w="60"/>
+              <w:left w:type="dxa" w:w="100"/>
+              <w:bottom w:type="dxa" w:w="60"/>
+              <w:right w:type="dxa" w:w="100"/>
+            </w:tcMar>
+          </w:tcPr>
+          <w:p>
+            <w:r>
+              <w:rPr>
+                <w:rFonts w:ascii="Calibri" w:cs="Calibri" w:eastAsia="Calibri" w:hAnsi="Calibri"/>
+                <w:b w:val="false"/>
+                <w:bCs w:val="false"/>
+                <w:sz w:val="18"/>
+                <w:szCs w:val="18"/>
+              </w:rPr>
+              <w:t xml:space="preserve">$3,396</w:t>
+            </w:r>
+          </w:p>
+        </w:tc>
+      </w:tr>
+      <w:tr>
+        <w:tc>
+          <w:tcPr>
+            <w:tcW w:type="dxa" w:w="1700"/>
+            <w:tcMar>
+              <w:top w:type="dxa" w:w="60"/>
+              <w:left w:type="dxa" w:w="100"/>
+              <w:bottom w:type="dxa" w:w="60"/>
+              <w:right w:type="dxa" w:w="100"/>
+            </w:tcMar>
+          </w:tcPr>
+          <w:p>
+            <w:r>
+              <w:rPr>
+                <w:rFonts w:ascii="Calibri" w:cs="Calibri" w:eastAsia="Calibri" w:hAnsi="Calibri"/>
+                <w:b w:val="false"/>
+                <w:bCs w:val="false"/>
+                <w:sz w:val="18"/>
+                <w:szCs w:val="18"/>
+              </w:rPr>
+              <w:t xml:space="preserve">Mar 2026</w:t>
+            </w:r>
+          </w:p>
+        </w:tc>
+        <w:tc>
+          <w:tcPr>
+            <w:tcW w:type="dxa" w:w="2600"/>
+            <w:tcMar>
+              <w:top w:type="dxa" w:w="60"/>
+              <w:left w:type="dxa" w:w="100"/>
+              <w:bottom w:type="dxa" w:w="60"/>
+              <w:right w:type="dxa" w:w="100"/>
+            </w:tcMar>
+          </w:tcPr>
+          <w:p>
+            <w:r>
+              <w:rPr>
+                <w:rFonts w:ascii="Calibri" w:cs="Calibri" w:eastAsia="Calibri" w:hAnsi="Calibri"/>
+                <w:b w:val="false"/>
+                <w:bCs w:val="false"/>
+                <w:sz w:val="18"/>
+                <w:szCs w:val="18"/>
+              </w:rPr>
+              <w:t xml:space="preserve">$74,628</w:t>
+            </w:r>
+          </w:p>
+        </w:tc>
+        <w:tc>
+          <w:tcPr>
+            <w:tcW w:type="dxa" w:w="2100"/>
+            <w:tcMar>
+              <w:top w:type="dxa" w:w="60"/>
+              <w:left w:type="dxa" w:w="100"/>
+              <w:bottom w:type="dxa" w:w="60"/>
+              <w:right w:type="dxa" w:w="100"/>
+            </w:tcMar>
+          </w:tcPr>
+          <w:p>
+            <w:r>
+              <w:rPr>
+                <w:rFonts w:ascii="Calibri" w:cs="Calibri" w:eastAsia="Calibri" w:hAnsi="Calibri"/>
+                <w:b w:val="false"/>
+                <w:bCs w:val="false"/>
+                <w:sz w:val="18"/>
+                <w:szCs w:val="18"/>
+              </w:rPr>
+              <w:t xml:space="preserve">88</w:t>
+            </w:r>
+          </w:p>
+        </w:tc>
+        <w:tc>
+          <w:tcPr>
+            <w:tcW w:type="dxa" w:w="2100"/>
+            <w:tcMar>
+              <w:top w:type="dxa" w:w="60"/>
+              <w:left w:type="dxa" w:w="100"/>
+              <w:bottom w:type="dxa" w:w="60"/>
+              <w:right w:type="dxa" w:w="100"/>
+            </w:tcMar>
+          </w:tcPr>
+          <w:p>
+            <w:r>
+              <w:rPr>
+                <w:rFonts w:ascii="Calibri" w:cs="Calibri" w:eastAsia="Calibri" w:hAnsi="Calibri"/>
+                <w:b w:val="false"/>
+                <w:bCs w:val="false"/>
+                <w:sz w:val="18"/>
+                <w:szCs w:val="18"/>
+              </w:rPr>
+              <w:t xml:space="preserve">$848</w:t>
+            </w:r>
+          </w:p>
+        </w:tc>
+        <w:tc>
+          <w:tcPr>
+            <w:tcW w:type="dxa" w:w="1900"/>
+            <w:tcMar>
+              <w:top w:type="dxa" w:w="60"/>
+              <w:left w:type="dxa" w:w="100"/>
+              <w:bottom w:type="dxa" w:w="60"/>
+              <w:right w:type="dxa" w:w="100"/>
+            </w:tcMar>
+          </w:tcPr>
+          <w:p>
+            <w:r>
+              <w:rPr>
+                <w:rFonts w:ascii="Calibri" w:cs="Calibri" w:eastAsia="Calibri" w:hAnsi="Calibri"/>
+                <w:b w:val="false"/>
+                <w:bCs w:val="false"/>
+                <w:sz w:val="18"/>
+                <w:szCs w:val="18"/>
+              </w:rPr>
+              <w:t xml:space="preserve">$1,419</w:t>
+            </w:r>
+          </w:p>
+        </w:tc>
+      </w:tr>
+      <w:tr>
+        <w:tc>
+          <w:tcPr>
+            <w:tcW w:type="dxa" w:w="1700"/>
+            <w:shd w:fill="F2F2F2" w:val="clear"/>
+            <w:tcMar>
+              <w:top w:type="dxa" w:w="60"/>
+              <w:left w:type="dxa" w:w="100"/>
+              <w:bottom w:type="dxa" w:w="60"/>
+              <w:right w:type="dxa" w:w="100"/>
+            </w:tcMar>
+          </w:tcPr>
+          <w:p>
+            <w:r>
+              <w:rPr>
+                <w:rFonts w:ascii="Calibri" w:cs="Calibri" w:eastAsia="Calibri" w:hAnsi="Calibri"/>
+                <w:b w:val="false"/>
+                <w:bCs w:val="false"/>
+                <w:sz w:val="18"/>
+                <w:szCs w:val="18"/>
+              </w:rPr>
+              <w:t xml:space="preserve">Apr 2026</w:t>
+            </w:r>
+          </w:p>
+        </w:tc>
+        <w:tc>
+          <w:tcPr>
+            <w:tcW w:type="dxa" w:w="2600"/>
+            <w:shd w:fill="F2F2F2" w:val="clear"/>
+            <w:tcMar>
+              <w:top w:type="dxa" w:w="60"/>
+              <w:left w:type="dxa" w:w="100"/>
+              <w:bottom w:type="dxa" w:w="60"/>
+              <w:right w:type="dxa" w:w="100"/>
+            </w:tcMar>
+          </w:tcPr>
+          <w:p>
+            <w:r>
+              <w:rPr>
+                <w:rFonts w:ascii="Calibri" w:cs="Calibri" w:eastAsia="Calibri" w:hAnsi="Calibri"/>
+                <w:b w:val="false"/>
+                <w:bCs w:val="false"/>
+                <w:sz w:val="18"/>
+                <w:szCs w:val="18"/>
+              </w:rPr>
+              <w:t xml:space="preserve">$86,764</w:t>
+            </w:r>
+          </w:p>
+        </w:tc>
+        <w:tc>
+          <w:tcPr>
+            <w:tcW w:type="dxa" w:w="2100"/>
+            <w:shd w:fill="F2F2F2" w:val="clear"/>
+            <w:tcMar>
+              <w:top w:type="dxa" w:w="60"/>
+              <w:left w:type="dxa" w:w="100"/>
+              <w:bottom w:type="dxa" w:w="60"/>
+              <w:right w:type="dxa" w:w="100"/>
+            </w:tcMar>
+          </w:tcPr>
+          <w:p>
+            <w:r>
+              <w:rPr>
+                <w:rFonts w:ascii="Calibri" w:cs="Calibri" w:eastAsia="Calibri" w:hAnsi="Calibri"/>
+                <w:b w:val="false"/>
+                <w:bCs w:val="false"/>
+                <w:sz w:val="18"/>
+                <w:szCs w:val="18"/>
+              </w:rPr>
+              <w:t xml:space="preserve">99</w:t>
+            </w:r>
+          </w:p>
+        </w:tc>
+        <w:tc>
+          <w:tcPr>
+            <w:tcW w:type="dxa" w:w="2100"/>
+            <w:shd w:fill="F2F2F2" w:val="clear"/>
+            <w:tcMar>
+              <w:top w:type="dxa" w:w="60"/>
+              <w:left w:type="dxa" w:w="100"/>
+              <w:bottom w:type="dxa" w:w="60"/>
+              <w:right w:type="dxa" w:w="100"/>
+            </w:tcMar>
+          </w:tcPr>
+          <w:p>
+            <w:r>
+              <w:rPr>
+                <w:rFonts w:ascii="Calibri" w:cs="Calibri" w:eastAsia="Calibri" w:hAnsi="Calibri"/>
+                <w:b w:val="false"/>
+                <w:bCs w:val="false"/>
+                <w:sz w:val="18"/>
+                <w:szCs w:val="18"/>
+              </w:rPr>
+              <w:t xml:space="preserve">$876</w:t>
+            </w:r>
+          </w:p>
+        </w:tc>
+        <w:tc>
+          <w:tcPr>
+            <w:tcW w:type="dxa" w:w="1900"/>
+            <w:shd w:fill="F2F2F2" w:val="clear"/>
+            <w:tcMar>
+              <w:top w:type="dxa" w:w="60"/>
+              <w:left w:type="dxa" w:w="100"/>
+              <w:bottom w:type="dxa" w:w="60"/>
+              <w:right w:type="dxa" w:w="100"/>
+            </w:tcMar>
+          </w:tcPr>
+          <w:p>
+            <w:r>
+              <w:rPr>
+                <w:rFonts w:ascii="Calibri" w:cs="Calibri" w:eastAsia="Calibri" w:hAnsi="Calibri"/>
+                <w:b w:val="false"/>
+                <w:bCs w:val="false"/>
+                <w:sz w:val="18"/>
+                <w:szCs w:val="18"/>
+              </w:rPr>
+              <w:t xml:space="preserve">$9,142</w:t>
+            </w:r>
+          </w:p>
+        </w:tc>
+      </w:tr>
+      <w:tr>
+        <w:tc>
+          <w:tcPr>
+            <w:tcW w:type="dxa" w:w="1700"/>
+            <w:tcMar>
+              <w:top w:type="dxa" w:w="60"/>
+              <w:left w:type="dxa" w:w="100"/>
+              <w:bottom w:type="dxa" w:w="60"/>
+              <w:right w:type="dxa" w:w="100"/>
+            </w:tcMar>
+          </w:tcPr>
+          <w:p>
+            <w:r>
+              <w:rPr>
+                <w:rFonts w:ascii="Calibri" w:cs="Calibri" w:eastAsia="Calibri" w:hAnsi="Calibri"/>
+                <w:b w:val="false"/>
+                <w:bCs w:val="false"/>
+                <w:sz w:val="18"/>
+                <w:szCs w:val="18"/>
+              </w:rPr>
+              <w:t xml:space="preserve">May 2026</w:t>
+            </w:r>
+          </w:p>
+        </w:tc>
+        <w:tc>
+          <w:tcPr>
+            <w:tcW w:type="dxa" w:w="2600"/>
+            <w:tcMar>
+              <w:top w:type="dxa" w:w="60"/>
+              <w:left w:type="dxa" w:w="100"/>
+              <w:bottom w:type="dxa" w:w="60"/>
+              <w:right w:type="dxa" w:w="100"/>
+            </w:tcMar>
+          </w:tcPr>
+          <w:p>
+            <w:r>
+              <w:rPr>
+                <w:rFonts w:ascii="Calibri" w:cs="Calibri" w:eastAsia="Calibri" w:hAnsi="Calibri"/>
+                <w:b w:val="false"/>
+                <w:bCs w:val="false"/>
+                <w:sz w:val="18"/>
+                <w:szCs w:val="18"/>
+              </w:rPr>
+              <w:t xml:space="preserve">$80,210</w:t>
+            </w:r>
+          </w:p>
+        </w:tc>
+        <w:tc>
+          <w:tcPr>
+            <w:tcW w:type="dxa" w:w="2100"/>
+            <w:tcMar>
+              <w:top w:type="dxa" w:w="60"/>
+              <w:left w:type="dxa" w:w="100"/>
+              <w:bottom w:type="dxa" w:w="60"/>
+              <w:right w:type="dxa" w:w="100"/>
+            </w:tcMar>
+          </w:tcPr>
+          <w:p>
+            <w:r>
+              <w:rPr>
+                <w:rFonts w:ascii="Calibri" w:cs="Calibri" w:eastAsia="Calibri" w:hAnsi="Calibri"/>
+                <w:b w:val="false"/>
+                <w:bCs w:val="false"/>
+                <w:sz w:val="18"/>
+                <w:szCs w:val="18"/>
+              </w:rPr>
+              <w:t xml:space="preserve">108</w:t>
+            </w:r>
+          </w:p>
+        </w:tc>
+        <w:tc>
+          <w:tcPr>
+            <w:tcW w:type="dxa" w:w="2100"/>
+            <w:tcMar>
+              <w:top w:type="dxa" w:w="60"/>
+              <w:left w:type="dxa" w:w="100"/>
+              <w:bottom w:type="dxa" w:w="60"/>
+              <w:right w:type="dxa" w:w="100"/>
+            </w:tcMar>
+          </w:tcPr>
+          <w:p>
+            <w:r>
+              <w:rPr>
+                <w:rFonts w:ascii="Calibri" w:cs="Calibri" w:eastAsia="Calibri" w:hAnsi="Calibri"/>
+                <w:b w:val="false"/>
+                <w:bCs w:val="false"/>
+                <w:sz w:val="18"/>
+                <w:szCs w:val="18"/>
+              </w:rPr>
+              <w:t xml:space="preserve">$743</w:t>
+            </w:r>
+          </w:p>
+        </w:tc>
+        <w:tc>
+          <w:tcPr>
+            <w:tcW w:type="dxa" w:w="1900"/>
+            <w:tcMar>
+              <w:top w:type="dxa" w:w="60"/>
+              <w:left w:type="dxa" w:w="100"/>
+              <w:bottom w:type="dxa" w:w="60"/>
+              <w:right w:type="dxa" w:w="100"/>
+            </w:tcMar>
+          </w:tcPr>
+          <w:p>
+            <w:r>
+              <w:rPr>
+                <w:rFonts w:ascii="Calibri" w:cs="Calibri" w:eastAsia="Calibri" w:hAnsi="Calibri"/>
+                <w:b w:val="false"/>
+                <w:bCs w:val="false"/>
+                <w:sz w:val="18"/>
+                <w:szCs w:val="18"/>
+              </w:rPr>
+              <w:t xml:space="preserve">$2,126</w:t>
+            </w:r>
+          </w:p>
+        </w:tc>
+      </w:tr>
+      <w:tr>
+        <w:tc>
+          <w:tcPr>
+            <w:tcW w:type="dxa" w:w="1700"/>
+            <w:shd w:fill="F2F2F2" w:val="clear"/>
+            <w:tcMar>
+              <w:top w:type="dxa" w:w="60"/>
+              <w:left w:type="dxa" w:w="100"/>
+              <w:bottom w:type="dxa" w:w="60"/>
+              <w:right w:type="dxa" w:w="100"/>
+            </w:tcMar>
+          </w:tcPr>
+          <w:p>
+            <w:r>
+              <w:rPr>
+                <w:rFonts w:ascii="Calibri" w:cs="Calibri" w:eastAsia="Calibri" w:hAnsi="Calibri"/>
+                <w:b w:val="false"/>
+                <w:bCs w:val="false"/>
+                <w:sz w:val="18"/>
+                <w:szCs w:val="18"/>
+              </w:rPr>
+              <w:t xml:space="preserve">Jun 2026</w:t>
+            </w:r>
+          </w:p>
+        </w:tc>
+        <w:tc>
+          <w:tcPr>
+            <w:tcW w:type="dxa" w:w="2600"/>
+            <w:shd w:fill="F2F2F2" w:val="clear"/>
+            <w:tcMar>
+              <w:top w:type="dxa" w:w="60"/>
+              <w:left w:type="dxa" w:w="100"/>
+              <w:bottom w:type="dxa" w:w="60"/>
+              <w:right w:type="dxa" w:w="100"/>
+            </w:tcMar>
+          </w:tcPr>
+          <w:p>
+            <w:r>
+              <w:rPr>
+                <w:rFonts w:ascii="Calibri" w:cs="Calibri" w:eastAsia="Calibri" w:hAnsi="Calibri"/>
+                <w:b w:val="false"/>
+                <w:bCs w:val="false"/>
+                <w:sz w:val="18"/>
+                <w:szCs w:val="18"/>
+              </w:rPr>
+              <w:t xml:space="preserve">$67,258</w:t>
+            </w:r>
+          </w:p>
+        </w:tc>
+        <w:tc>
+          <w:tcPr>
+            <w:tcW w:type="dxa" w:w="2100"/>
+            <w:shd w:fill="F2F2F2" w:val="clear"/>
+            <w:tcMar>
+              <w:top w:type="dxa" w:w="60"/>
+              <w:left w:type="dxa" w:w="100"/>
+              <w:bottom w:type="dxa" w:w="60"/>
+              <w:right w:type="dxa" w:w="100"/>
+            </w:tcMar>
+          </w:tcPr>
+          <w:p>
+            <w:r>
+              <w:rPr>
+                <w:rFonts w:ascii="Calibri" w:cs="Calibri" w:eastAsia="Calibri" w:hAnsi="Calibri"/>
+                <w:b w:val="false"/>
+                <w:bCs w:val="false"/>
+                <w:sz w:val="18"/>
+                <w:szCs w:val="18"/>
+              </w:rPr>
+              <w:t xml:space="preserve">119</w:t>
+            </w:r>
+          </w:p>
+        </w:tc>
+        <w:tc>
+          <w:tcPr>
+            <w:tcW w:type="dxa" w:w="2100"/>
+            <w:shd w:fill="F2F2F2" w:val="clear"/>
+            <w:tcMar>
+              <w:top w:type="dxa" w:w="60"/>
+              <w:left w:type="dxa" w:w="100"/>
+              <w:bottom w:type="dxa" w:w="60"/>
+              <w:right w:type="dxa" w:w="100"/>
+            </w:tcMar>
+          </w:tcPr>
+          <w:p>
+            <w:r>
+              <w:rPr>
+                <w:rFonts w:ascii="Calibri" w:cs="Calibri" w:eastAsia="Calibri" w:hAnsi="Calibri"/>
+                <w:b w:val="false"/>
+                <w:bCs w:val="false"/>
+                <w:sz w:val="18"/>
+                <w:szCs w:val="18"/>
+              </w:rPr>
+              <w:t xml:space="preserve">$565</w:t>
+            </w:r>
+          </w:p>
+        </w:tc>
+        <w:tc>
+          <w:tcPr>
+            <w:tcW w:type="dxa" w:w="1900"/>
+            <w:shd w:fill="F2F2F2" w:val="clear"/>
+            <w:tcMar>
+              <w:top w:type="dxa" w:w="60"/>
+              <w:left w:type="dxa" w:w="100"/>
+              <w:bottom w:type="dxa" w:w="60"/>
+              <w:right w:type="dxa" w:w="100"/>
+            </w:tcMar>
+          </w:tcPr>
+          <w:p>
+            <w:r>
+              <w:rPr>
+                <w:rFonts w:ascii="Calibri" w:cs="Calibri" w:eastAsia="Calibri" w:hAnsi="Calibri"/>
+                <w:b w:val="false"/>
+                <w:bCs w:val="false"/>
+                <w:sz w:val="18"/>
+                <w:szCs w:val="18"/>
+              </w:rPr>
+              <w:t xml:space="preserve">$3,021</w:t>
+            </w:r>
+          </w:p>
+        </w:tc>
+      </w:tr>
+      <w:tr>
+        <w:tc>
+          <w:tcPr>
+            <w:tcW w:type="dxa" w:w="1700"/>
+            <w:tcMar>
+              <w:top w:type="dxa" w:w="60"/>
+              <w:left w:type="dxa" w:w="100"/>
+              <w:bottom w:type="dxa" w:w="60"/>
+              <w:right w:type="dxa" w:w="100"/>
+            </w:tcMar>
+          </w:tcPr>
+          <w:p>
+            <w:r>
+              <w:rPr>
+                <w:rFonts w:ascii="Calibri" w:cs="Calibri" w:eastAsia="Calibri" w:hAnsi="Calibri"/>
+                <w:b w:val="false"/>
+                <w:bCs w:val="false"/>
+                <w:sz w:val="18"/>
+                <w:szCs w:val="18"/>
+              </w:rPr>
+              <w:t xml:space="preserve">Jul → 20</w:t>
+            </w:r>
+          </w:p>
+        </w:tc>
+        <w:tc>
+          <w:tcPr>
+            <w:tcW w:type="dxa" w:w="2600"/>
+            <w:tcMar>
+              <w:top w:type="dxa" w:w="60"/>
+              <w:left w:type="dxa" w:w="100"/>
+              <w:bottom w:type="dxa" w:w="60"/>
+              <w:right w:type="dxa" w:w="100"/>
+            </w:tcMar>
+          </w:tcPr>
+          <w:p>
+            <w:r>
+              <w:rPr>
+                <w:rFonts w:ascii="Calibri" w:cs="Calibri" w:eastAsia="Calibri" w:hAnsi="Calibri"/>
+                <w:b w:val="false"/>
+                <w:bCs w:val="false"/>
+                <w:sz w:val="18"/>
+                <w:szCs w:val="18"/>
+              </w:rPr>
+              <w:t xml:space="preserve">$50,672</w:t>
+            </w:r>
+          </w:p>
+        </w:tc>
+        <w:tc>
+          <w:tcPr>
+            <w:tcW w:type="dxa" w:w="2100"/>
+            <w:tcMar>
+              <w:top w:type="dxa" w:w="60"/>
+              <w:left w:type="dxa" w:w="100"/>
+              <w:bottom w:type="dxa" w:w="60"/>
+              <w:right w:type="dxa" w:w="100"/>
+            </w:tcMar>
+          </w:tcPr>
+          <w:p>
+            <w:r>
+              <w:rPr>
+                <w:rFonts w:ascii="Calibri" w:cs="Calibri" w:eastAsia="Calibri" w:hAnsi="Calibri"/>
+                <w:b w:val="false"/>
+                <w:bCs w:val="false"/>
+                <w:sz w:val="18"/>
+                <w:szCs w:val="18"/>
+              </w:rPr>
+              <w:t xml:space="preserve">64</w:t>
+            </w:r>
+          </w:p>
+        </w:tc>
+        <w:tc>
+          <w:tcPr>
+            <w:tcW w:type="dxa" w:w="2100"/>
+            <w:tcMar>
+              <w:top w:type="dxa" w:w="60"/>
+              <w:left w:type="dxa" w:w="100"/>
+              <w:bottom w:type="dxa" w:w="60"/>
+              <w:right w:type="dxa" w:w="100"/>
+            </w:tcMar>
+          </w:tcPr>
+          <w:p>
+            <w:r>
+              <w:rPr>
+                <w:rFonts w:ascii="Calibri" w:cs="Calibri" w:eastAsia="Calibri" w:hAnsi="Calibri"/>
+                <w:b w:val="false"/>
+                <w:bCs w:val="false"/>
+                <w:sz w:val="18"/>
+                <w:szCs w:val="18"/>
+              </w:rPr>
+              <w:t xml:space="preserve">$792</w:t>
+            </w:r>
+          </w:p>
+        </w:tc>
+        <w:tc>
+          <w:tcPr>
+            <w:tcW w:type="dxa" w:w="1900"/>
+            <w:tcMar>
+              <w:top w:type="dxa" w:w="60"/>
+              <w:left w:type="dxa" w:w="100"/>
+              <w:bottom w:type="dxa" w:w="60"/>
+              <w:right w:type="dxa" w:w="100"/>
+            </w:tcMar>
+          </w:tcPr>
+          <w:p>
+            <w:r>
+              <w:rPr>
+                <w:rFonts w:ascii="Calibri" w:cs="Calibri" w:eastAsia="Calibri" w:hAnsi="Calibri"/>
+                <w:b w:val="false"/>
+                <w:bCs w:val="false"/>
+                <w:sz w:val="18"/>
+                <w:szCs w:val="18"/>
+              </w:rPr>
+              <w:t xml:space="preserve">$1,896</w:t>
+            </w:r>
+          </w:p>
+        </w:tc>
+      </w:tr>
+    </w:tbl>
+    <w:p>
+      <w:pPr>
+        <w:spacing w:after="120"/>
+      </w:pPr>
+      <w:r>
+        <w:rPr>
+          <w:rFonts w:ascii="Calibri" w:cs="Calibri" w:eastAsia="Calibri" w:hAnsi="Calibri"/>
+          <w:sz w:val="22"/>
+          <w:szCs w:val="22"/>
+        </w:rPr>
+        <w:t xml:space="preserve"/>
+      </w:r>
+    </w:p>
+    <w:p>
+      <w:pPr>
+        <w:pStyle w:val="ListParagraph"/>
+        <w:numPr>
+          <w:ilvl w:val="0"/>
+          <w:numId w:val="2"/>
+        </w:numPr>
+        <w:spacing w:after="80"/>
+      </w:pPr>
+      <w:r>
+        <w:rPr>
+          <w:rFonts w:ascii="Calibri" w:cs="Calibri" w:eastAsia="Calibri" w:hAnsi="Calibri"/>
+          <w:sz w:val="22"/>
+          <w:szCs w:val="22"/>
+        </w:rPr>
+        <w:t xml:space="preserve">The Stripe engine shrank ~55% Nov→Jun while the funnel improved. Payers bottomed in February (86) and recovered every month since (119 by June), but revenue/payer fell to $565 — the new cohorts skew to $99/$499 while higher-value legacy payers roll off. July’s partial pace (~$76k full-month equivalent) suggests stabilization.</w:t>
+      </w:r>
+    </w:p>
+    <w:p>
+      <w:pPr>
+        <w:pStyle w:val="ListParagraph"/>
+        <w:numPr>
+          <w:ilvl w:val="0"/>
+          <w:numId w:val="2"/>
+        </w:numPr>
+        <w:spacing w:after="80"/>
+      </w:pPr>
+      <w:r>
+        <w:rPr>
+          <w:rFonts w:ascii="Calibri" w:cs="Calibri" w:eastAsia="Calibri" w:hAnsi="Calibri"/>
+          <w:sz w:val="22"/>
+          <w:szCs w:val="22"/>
+        </w:rPr>
+        <w:t xml:space="preserve">Customer value (trailing 12 months, all Stripe payers): average total charged $2,549; median $959; p90 $5,489; 3.35 succeeded charges per payer. Use the median for a typical self-serve customer — the mean is pulled up by a heavy tail (custom charges up to $7,500 observed).</w:t>
+      </w:r>
+    </w:p>
+    <w:p>
+      <w:pPr>
+        <w:pStyle w:val="ListParagraph"/>
+        <w:numPr>
+          <w:ilvl w:val="0"/>
+          <w:numId w:val="2"/>
+        </w:numPr>
+        <w:spacing w:after="80"/>
+      </w:pPr>
+      <w:r>
+        <w:rPr>
+          <w:rFonts w:ascii="Calibri" w:cs="Calibri" w:eastAsia="Calibri" w:hAnsi="Calibri"/>
+          <w:sz w:val="22"/>
+          <w:szCs w:val="22"/>
+        </w:rPr>
+        <w:t xml:space="preserve">Observed price points don’t match the documented $99/$499/$1200 list: Apr–Jul mix includes $599×69, $175×42, $959×27 — undocumented price points; confirm which plans these are. [Q28]</w:t>
+      </w:r>
+    </w:p>
+    <w:p>
+      <w:pPr>
+        <w:pStyle w:val="ListParagraph"/>
+        <w:numPr>
+          <w:ilvl w:val="0"/>
+          <w:numId w:val="2"/>
+        </w:numPr>
+        <w:spacing w:after="80"/>
+      </w:pPr>
+      <w:r>
+        <w:rPr>
+          <w:rFonts w:ascii="Calibri" w:cs="Calibri" w:eastAsia="Calibri" w:hAnsi="Calibri"/>
+          <w:sz w:val="22"/>
+          <w:szCs w:val="22"/>
+        </w:rPr>
+        <w:t xml:space="preserve">Refunds run ~2–8% of gross ($1.4k–$12.3k/month; April spiked to $9.1k during the abuse wave).</w:t>
+      </w:r>
+    </w:p>
+    <w:p>
+      <w:pPr>
+        <w:pStyle w:val="Heading1"/>
+        <w:spacing w:after="140" w:before="280"/>
+      </w:pPr>
+      <w:r>
+        <w:rPr>
+          <w:rFonts w:ascii="Calibri" w:cs="Calibri" w:eastAsia="Calibri" w:hAnsi="Calibri"/>
+        </w:rPr>
+        <w:t xml:space="preserve">4. Funnel B — sales-led (Close CRM mirrors — approximate)</w:t>
       </w:r>
     </w:p>
     <w:p>
@@ -4811,7 +6180,7 @@
         <w:rPr>
           <w:rFonts w:ascii="Calibri" w:cs="Calibri" w:eastAsia="Calibri" w:hAnsi="Calibri"/>
         </w:rPr>
-        <w:t xml:space="preserve">4. What’s blocked and why</w:t>
+        <w:t xml:space="preserve">5. What’s blocked and why</w:t>
       </w:r>
     </w:p>
     <w:tbl>
@@ -4931,7 +6300,7 @@
                 <w:sz w:val="18"/>
                 <w:szCs w:val="18"/>
               </w:rPr>
-              <w:t xml:space="preserve">Dollars (MRR, ARPU, NRR, deal values)</w:t>
+              <w:t xml:space="preserve">Complete dollars (Cardcom + manual deals; MRR, NRR)</w:t>
             </w:r>
           </w:p>
         </w:tc>
@@ -4954,7 +6323,7 @@
                 <w:sz w:val="18"/>
                 <w:szCs w:val="18"/>
               </w:rPr>
-              <w:t xml:space="preserve">prod user_payments + IMAI Close org access (connector reaches NewVoices org, Q6)</w:t>
+              <w:t xml:space="preserve">prod user_payments + IMAI Close org (Q6); Stripe-integration completeness unverified (Q28)</w:t>
             </w:r>
           </w:p>
         </w:tc>
@@ -4977,7 +6346,7 @@
                 <w:sz w:val="18"/>
                 <w:szCs w:val="18"/>
               </w:rPr>
-              <w:t xml:space="preserve">The full revenue picture</w:t>
+              <w:t xml:space="preserve">The full revenue picture (Stripe-only view is partial)</w:t>
             </w:r>
           </w:p>
         </w:tc>
@@ -5211,7 +6580,7 @@
         <w:rPr>
           <w:rFonts w:ascii="Calibri" w:cs="Calibri" w:eastAsia="Calibri" w:hAnsi="Calibri"/>
         </w:rPr>
-        <w:t xml:space="preserve">5. Recommendations (evidence-linked)</w:t>
+        <w:t xml:space="preserve">6. Recommendations (evidence-linked)</w:t>
       </w:r>
     </w:p>
     <w:p>
@@ -5319,7 +6688,25 @@
           <w:sz w:val="22"/>
           <w:szCs w:val="22"/>
         </w:rPr>
-        <w:t xml:space="preserve">Build the expansion motion: 2–5 upgrades/month; limit/upgrade instrumentation is trial-only, so paying users hitting plan ceilings are invisible and unprompted. [§2]</w:t>
+        <w:t xml:space="preserve">Attack the revenue-mix decline, not just conversion counts: verify the Stripe trend vs the Stripe dashboard (Q28), then decide whether the fix is pricing/packaging (new cohorts buy small), win-back of high-value churned payers, or expansion. Record conversion months at low first-charge values cannot replace $874-ARPU legacy payers 1:1. [§3]</w:t>
+      </w:r>
+    </w:p>
+    <w:p>
+      <w:pPr>
+        <w:pStyle w:val="ListParagraph"/>
+        <w:numPr>
+          <w:ilvl w:val="0"/>
+          <w:numId w:val="2"/>
+        </w:numPr>
+        <w:spacing w:after="80"/>
+      </w:pPr>
+      <w:r>
+        <w:rPr>
+          <w:rFonts w:ascii="Calibri" w:cs="Calibri" w:eastAsia="Calibri" w:hAnsi="Calibri"/>
+          <w:sz w:val="22"/>
+          <w:szCs w:val="22"/>
+        </w:rPr>
+        <w:t xml:space="preserve">Build the expansion motion: 2–5 upgrades/month; limit/upgrade instrumentation is trial-only, so paying users hitting plan ceilings are invisible and unprompted — and it is the direct counter to falling revenue-per-payer. [§2, §3]</w:t>
       </w:r>
     </w:p>
     <w:p>
@@ -5338,7 +6725,7 @@
           <w:sz w:val="18"/>
           <w:szCs w:val="18"/>
         </w:rPr>
-        <w:t xml:space="preserve">Sources: Mixpanel project 3432835 queried live 2026-07-21 — monthly insights (unique users) for funnel and CRM-mirror events; per-cohort funnels reports (14-day window) Feb–Jun; geo breakdown of free_trial_blocked vs Free Trial Signup Apr 1–Jul 20; Payment Attempt by Status. Method: docs-events-audit/prompts/sales-funnel-report-prompt.md. No dollar figures by design — the event log captured ~36% of recurring dollars (June 2026); revenue lives in prod user_payments + Close.</w:t>
+        <w:t xml:space="preserve">Sources: Mixpanel project 3432835 queried live 2026-07-21 — monthly insights (unique users) for funnel and CRM-mirror events; per-cohort funnels reports (14-day window) Feb–Jun; geo breakdown of free_trial_blocked vs Free Trial Signup Apr 1–Jul 20; Payment Attempt by Status. Method: docs-events-audit/prompts/sales-funnel-report-prompt.md. Dollar figures come solely from the Stripe→Mixpanel integration (Amount Charged, Status=succeeded): Stripe self-serve only, unverified vs the Stripe dashboard (Q28). Webhook-event dollars remain unusable (stripped, Q27; ~36% coverage). Complete revenue requires prod user_payments + Close.</w:t>
       </w:r>
     </w:p>
     <w:sectPr>

</xml_diff>